<commit_message>
Run4 with leadlag calculations
</commit_message>
<xml_diff>
--- a/Summary_of_runs.docx
+++ b/Summary_of_runs.docx
@@ -6,23 +6,37 @@
       <w:r>
         <w:t>Run 1 – data from 2011 to 2023</w:t>
       </w:r>
+      <w:r>
+        <w:t xml:space="preserve"> - monthly</w:t>
+      </w:r>
     </w:p>
     <w:p>
       <w:r>
         <w:t>Run 2 – data from 2016 to 2024 – regime shift</w:t>
       </w:r>
+      <w:r>
+        <w:t xml:space="preserve"> - monthly</w:t>
+      </w:r>
     </w:p>
     <w:p>
       <w:r>
-        <w:t xml:space="preserve">Run 3 – </w:t>
+        <w:t>Run 3 – 3 day data from autosampler, data from stations</w:t>
       </w:r>
-      <w:proofErr w:type="gramStart"/>
+    </w:p>
+    <w:p>
       <w:r>
-        <w:t>3 day</w:t>
+        <w:t>Sat – satellite imagery from USF and wind data from Key West</w:t>
       </w:r>
-      <w:proofErr w:type="gramEnd"/>
+    </w:p>
+    <w:p>
       <w:r>
-        <w:t xml:space="preserve"> data from autosampler, data from stations</w:t>
+        <w:t xml:space="preserve">Run 4 – data from </w:t>
+      </w:r>
+      <w:r>
+        <w:t>2016-03-01 – 2024-02-01 to match sat imagery</w:t>
+      </w:r>
+      <w:r>
+        <w:t xml:space="preserve"> - monthly</w:t>
       </w:r>
     </w:p>
     <w:p/>

</xml_diff>